<commit_message>
add TcHmi Installation issue with latest versions of TwinCAT
</commit_message>
<xml_diff>
--- a/RandomErrorList.docx
+++ b/RandomErrorList.docx
@@ -147,6 +147,9 @@
     <w:p/>
     <w:p>
       <w:r>
+        <w:rPr>
+          <w:noProof/>
+        </w:rPr>
         <w:drawing>
           <wp:inline distT="0" distB="0" distL="0" distR="0" wp14:anchorId="27B6AF48" wp14:editId="0C37FF0C">
             <wp:extent cx="3832860" cy="2240280"/>
@@ -198,56 +201,19 @@
       </w:r>
     </w:p>
     <w:p>
-      <w:proofErr w:type="gramStart"/>
-      <w:r>
-        <w:t>his</w:t>
-      </w:r>
-      <w:proofErr w:type="gramEnd"/>
-      <w:r>
-        <w:t xml:space="preserve"> behavior is already known and is often related to a faulty upgrade of </w:t>
-      </w:r>
-      <w:proofErr w:type="spellStart"/>
-      <w:r>
-        <w:t>twincat</w:t>
-      </w:r>
-      <w:proofErr w:type="spellEnd"/>
-      <w:r>
-        <w:t>.</w:t>
+      <w:r>
+        <w:t>his behavior is already known and is often related to a faulty upgrade of twincat.</w:t>
       </w:r>
       <w:r>
         <w:br/>
-        <w:t xml:space="preserve">For example, on the affected systems, RM 4026.22 is installed, but the </w:t>
-      </w:r>
-      <w:proofErr w:type="spellStart"/>
-      <w:r>
-        <w:t>twincat.standard.xae</w:t>
-      </w:r>
-      <w:proofErr w:type="spellEnd"/>
-      <w:r>
-        <w:t>/</w:t>
-      </w:r>
-      <w:proofErr w:type="spellStart"/>
-      <w:r>
-        <w:t>xar</w:t>
-      </w:r>
-      <w:proofErr w:type="spellEnd"/>
-      <w:r>
-        <w:t xml:space="preserve"> workload is still at an older version.</w:t>
+        <w:t>For example, on the affected systems, RM 4026.22 is installed, but the twincat.standard.xae/xar workload is still at an older version.</w:t>
       </w:r>
       <w:r>
         <w:br/>
       </w:r>
       <w:r>
         <w:br/>
-        <w:t xml:space="preserve">check the installed workloads in </w:t>
-      </w:r>
-      <w:proofErr w:type="gramStart"/>
-      <w:r>
-        <w:t>those system</w:t>
-      </w:r>
-      <w:proofErr w:type="gramEnd"/>
-      <w:r>
-        <w:t>.</w:t>
+        <w:t>check the installed workloads in those system.</w:t>
       </w:r>
     </w:p>
     <w:p>
@@ -256,13 +222,8 @@
       </w:r>
     </w:p>
     <w:p>
-      <w:proofErr w:type="gramStart"/>
-      <w:r>
-        <w:t>if</w:t>
-      </w:r>
-      <w:proofErr w:type="gramEnd"/>
-      <w:r>
-        <w:t xml:space="preserve"> there is something missing simply try to install the workload</w:t>
+      <w:r>
+        <w:t>if there is something missing simply try to install the workload</w:t>
       </w:r>
     </w:p>
     <w:p>
@@ -274,36 +235,12 @@
       </w:r>
       <w:r>
         <w:br/>
-      </w:r>
-      <w:proofErr w:type="spellStart"/>
-      <w:r>
-        <w:t>tcpkg</w:t>
-      </w:r>
-      <w:proofErr w:type="spellEnd"/>
-      <w:r>
-        <w:t xml:space="preserve"> install </w:t>
-      </w:r>
-      <w:proofErr w:type="spellStart"/>
-      <w:r>
-        <w:t>twincat.standard.xae</w:t>
-      </w:r>
-      <w:proofErr w:type="spellEnd"/>
+        <w:t>tcpkg install twincat.standard.xae</w:t>
+      </w:r>
       <w:r>
         <w:br/>
-      </w:r>
-      <w:proofErr w:type="spellStart"/>
-      <w:r>
-        <w:t>tcpkg</w:t>
-      </w:r>
-      <w:proofErr w:type="spellEnd"/>
-      <w:r>
-        <w:t xml:space="preserve"> install </w:t>
-      </w:r>
-      <w:proofErr w:type="spellStart"/>
-      <w:r>
-        <w:t>twincat.standard.xar</w:t>
-      </w:r>
-      <w:proofErr w:type="spellEnd"/>
+        <w:t>tcpkg install twincat.standard.xar</w:t>
+      </w:r>
     </w:p>
     <w:p>
       <w:r>
@@ -312,15 +249,7 @@
     </w:p>
     <w:p>
       <w:r>
-        <w:t xml:space="preserve">If there is nothing </w:t>
-      </w:r>
-      <w:proofErr w:type="gramStart"/>
-      <w:r>
-        <w:t>missing</w:t>
-      </w:r>
-      <w:proofErr w:type="gramEnd"/>
-      <w:r>
-        <w:t xml:space="preserve"> try a repair:</w:t>
+        <w:t>If there is nothing missing try a repair:</w:t>
       </w:r>
     </w:p>
     <w:p>
@@ -331,22 +260,131 @@
       </w:pPr>
       <w:r>
         <w:br/>
-      </w:r>
-      <w:proofErr w:type="spellStart"/>
-      <w:r>
-        <w:t>Tcpkg</w:t>
-      </w:r>
-      <w:proofErr w:type="spellEnd"/>
-      <w:r>
-        <w:t xml:space="preserve"> repair </w:t>
-      </w:r>
-      <w:proofErr w:type="spellStart"/>
-      <w:r>
-        <w:t>TwinCAT.Standard.XAE</w:t>
-      </w:r>
-      <w:proofErr w:type="spellEnd"/>
-      <w:r>
-        <w:t xml:space="preserve"> --include-dependencies</w:t>
+        <w:t>Tcpkg repair TwinCAT.Standard.XAE --include-dependencies</w:t>
+      </w:r>
+    </w:p>
+    <w:p>
+      <w:r>
+        <w:rPr>
+          <w:noProof/>
+        </w:rPr>
+        <w:drawing>
+          <wp:inline distT="0" distB="0" distL="0" distR="0" wp14:anchorId="770BCB94" wp14:editId="58AA9B35">
+            <wp:extent cx="10995660" cy="5334000"/>
+            <wp:effectExtent l="0" t="0" r="0" b="0"/>
+            <wp:docPr id="1820141553" name="Picture 2"/>
+            <wp:cNvGraphicFramePr>
+              <a:graphicFrameLocks xmlns:a="http://schemas.openxmlformats.org/drawingml/2006/main" noChangeAspect="1"/>
+            </wp:cNvGraphicFramePr>
+            <a:graphic xmlns:a="http://schemas.openxmlformats.org/drawingml/2006/main">
+              <a:graphicData uri="http://schemas.openxmlformats.org/drawingml/2006/picture">
+                <pic:pic xmlns:pic="http://schemas.openxmlformats.org/drawingml/2006/picture">
+                  <pic:nvPicPr>
+                    <pic:cNvPr id="0" name="Picture 6"/>
+                    <pic:cNvPicPr>
+                      <a:picLocks noChangeAspect="1" noChangeArrowheads="1"/>
+                    </pic:cNvPicPr>
+                  </pic:nvPicPr>
+                  <pic:blipFill>
+                    <a:blip r:embed="rId7">
+                      <a:extLst>
+                        <a:ext uri="{28A0092B-C50C-407E-A947-70E740481C1C}">
+                          <a14:useLocalDpi xmlns:a14="http://schemas.microsoft.com/office/drawing/2010/main" val="0"/>
+                        </a:ext>
+                      </a:extLst>
+                    </a:blip>
+                    <a:srcRect/>
+                    <a:stretch>
+                      <a:fillRect/>
+                    </a:stretch>
+                  </pic:blipFill>
+                  <pic:spPr bwMode="auto">
+                    <a:xfrm>
+                      <a:off x="0" y="0"/>
+                      <a:ext cx="10995660" cy="5334000"/>
+                    </a:xfrm>
+                    <a:prstGeom prst="rect">
+                      <a:avLst/>
+                    </a:prstGeom>
+                    <a:noFill/>
+                    <a:ln>
+                      <a:noFill/>
+                    </a:ln>
+                  </pic:spPr>
+                </pic:pic>
+              </a:graphicData>
+            </a:graphic>
+          </wp:inline>
+        </w:drawing>
+      </w:r>
+    </w:p>
+    <w:p>
+      <w:pPr>
+        <w:pBdr>
+          <w:bottom w:val="single" w:sz="6" w:space="1" w:color="auto"/>
+        </w:pBdr>
+      </w:pPr>
+    </w:p>
+    <w:p>
+      <w:r>
+        <w:t>TcHmi Installation issue with latest TwinCAT versions</w:t>
+      </w:r>
+    </w:p>
+    <w:p>
+      <w:r>
+        <w:drawing>
+          <wp:inline distT="0" distB="0" distL="0" distR="0" wp14:anchorId="479A953D" wp14:editId="096CEC44">
+            <wp:extent cx="3314700" cy="1737360"/>
+            <wp:effectExtent l="0" t="0" r="0" b="0"/>
+            <wp:docPr id="902153326" name="Picture 2"/>
+            <wp:cNvGraphicFramePr>
+              <a:graphicFrameLocks xmlns:a="http://schemas.openxmlformats.org/drawingml/2006/main" noChangeAspect="1"/>
+            </wp:cNvGraphicFramePr>
+            <a:graphic xmlns:a="http://schemas.openxmlformats.org/drawingml/2006/main">
+              <a:graphicData uri="http://schemas.openxmlformats.org/drawingml/2006/picture">
+                <pic:pic xmlns:pic="http://schemas.openxmlformats.org/drawingml/2006/picture">
+                  <pic:nvPicPr>
+                    <pic:cNvPr id="0" name="Picture 6"/>
+                    <pic:cNvPicPr>
+                      <a:picLocks noChangeAspect="1" noChangeArrowheads="1"/>
+                    </pic:cNvPicPr>
+                  </pic:nvPicPr>
+                  <pic:blipFill>
+                    <a:blip r:embed="rId8">
+                      <a:extLst>
+                        <a:ext uri="{28A0092B-C50C-407E-A947-70E740481C1C}">
+                          <a14:useLocalDpi xmlns:a14="http://schemas.microsoft.com/office/drawing/2010/main" val="0"/>
+                        </a:ext>
+                      </a:extLst>
+                    </a:blip>
+                    <a:srcRect/>
+                    <a:stretch>
+                      <a:fillRect/>
+                    </a:stretch>
+                  </pic:blipFill>
+                  <pic:spPr bwMode="auto">
+                    <a:xfrm>
+                      <a:off x="0" y="0"/>
+                      <a:ext cx="3314700" cy="1737360"/>
+                    </a:xfrm>
+                    <a:prstGeom prst="rect">
+                      <a:avLst/>
+                    </a:prstGeom>
+                    <a:noFill/>
+                    <a:ln>
+                      <a:noFill/>
+                    </a:ln>
+                  </pic:spPr>
+                </pic:pic>
+              </a:graphicData>
+            </a:graphic>
+          </wp:inline>
+        </w:drawing>
+      </w:r>
+    </w:p>
+    <w:p>
+      <w:r>
+        <w:t>Microsoft Visual C++ 2010 Runtime also should fix this</w:t>
       </w:r>
     </w:p>
     <w:p/>

</xml_diff>